<commit_message>
presentacion y doc con descripción de outcomes
</commit_message>
<xml_diff>
--- a/Auxiliar/outcomes.docx
+++ b/Auxiliar/outcomes.docx
@@ -1,6 +1,6 @@
 
 <file path=word/document.xml><?xml version="1.0" encoding="utf-8"?>
-<w:document xmlns:wpc="http://schemas.microsoft.com/office/word/2010/wordprocessingCanvas" xmlns:cx="http://schemas.microsoft.com/office/drawing/2014/chartex" xmlns:cx1="http://schemas.microsoft.com/office/drawing/2015/9/8/chartex" xmlns:cx2="http://schemas.microsoft.com/office/drawing/2015/10/21/chartex" xmlns:cx3="http://schemas.microsoft.com/office/drawing/2016/5/9/chartex" xmlns:cx4="http://schemas.microsoft.com/office/drawing/2016/5/10/chartex" xmlns:cx5="http://schemas.microsoft.com/office/drawing/2016/5/11/chartex" xmlns:cx6="http://schemas.microsoft.com/office/drawing/2016/5/12/chartex" xmlns:cx7="http://schemas.microsoft.com/office/drawing/2016/5/13/chartex" xmlns:cx8="http://schemas.microsoft.com/office/drawing/2016/5/14/chartex" xmlns:mc="http://schemas.openxmlformats.org/markup-compatibility/2006" xmlns:aink="http://schemas.microsoft.com/office/drawing/2016/ink" xmlns:am3d="http://schemas.microsoft.com/office/drawing/2017/model3d" xmlns:o="urn:schemas-microsoft-com:office:office" xmlns:oel="http://schemas.microsoft.com/office/2019/extlst" xmlns:r="http://schemas.openxmlformats.org/officeDocument/2006/relationships" xmlns:m="http://schemas.openxmlformats.org/officeDocument/2006/math" xmlns:v="urn:schemas-microsoft-com:vml" xmlns:wp14="http://schemas.microsoft.com/office/word/2010/wordprocessingDrawing" xmlns:wp="http://schemas.openxmlformats.org/drawingml/2006/wordprocessingDrawing" xmlns:w10="urn:schemas-microsoft-com:office:word" xmlns:w="http://schemas.openxmlformats.org/wordprocessingml/2006/main" xmlns:w14="http://schemas.microsoft.com/office/word/2010/wordml" xmlns:w15="http://schemas.microsoft.com/office/word/2012/wordml" xmlns:w16cex="http://schemas.microsoft.com/office/word/2018/wordml/cex" xmlns:w16cid="http://schemas.microsoft.com/office/word/2016/wordml/cid" xmlns:w16="http://schemas.microsoft.com/office/word/2018/wordml" xmlns:w16du="http://schemas.microsoft.com/office/word/2023/wordml/word16du" xmlns:w16sdtdh="http://schemas.microsoft.com/office/word/2020/wordml/sdtdatahash" xmlns:w16sdtfl="http://schemas.microsoft.com/office/word/2024/wordml/sdtformatlock" xmlns:w16se="http://schemas.microsoft.com/office/word/2015/wordml/symex" xmlns:wpg="http://schemas.microsoft.com/office/word/2010/wordprocessingGroup" xmlns:wpi="http://schemas.microsoft.com/office/word/2010/wordprocessingInk" xmlns:wne="http://schemas.microsoft.com/office/word/2006/wordml" xmlns:wps="http://schemas.microsoft.com/office/word/2010/wordprocessingShape" mc:Ignorable="w14 w15 w16se w16cid w16 w16cex w16sdtdh w16sdtfl w16du wp14">
+<w:document xmlns:wpc="http://schemas.microsoft.com/office/word/2010/wordprocessingCanvas" xmlns:cx="http://schemas.microsoft.com/office/drawing/2014/chartex" xmlns:cx1="http://schemas.microsoft.com/office/drawing/2015/9/8/chartex" xmlns:cx2="http://schemas.microsoft.com/office/drawing/2015/10/21/chartex" xmlns:cx3="http://schemas.microsoft.com/office/drawing/2016/5/9/chartex" xmlns:cx4="http://schemas.microsoft.com/office/drawing/2016/5/10/chartex" xmlns:cx5="http://schemas.microsoft.com/office/drawing/2016/5/11/chartex" xmlns:cx6="http://schemas.microsoft.com/office/drawing/2016/5/12/chartex" xmlns:cx7="http://schemas.microsoft.com/office/drawing/2016/5/13/chartex" xmlns:cx8="http://schemas.microsoft.com/office/drawing/2016/5/14/chartex" xmlns:mc="http://schemas.openxmlformats.org/markup-compatibility/2006" xmlns:m="http://schemas.openxmlformats.org/officeDocument/2006/math" xmlns:aink="http://schemas.microsoft.com/office/drawing/2016/ink" xmlns:am3d="http://schemas.microsoft.com/office/drawing/2017/model3d" xmlns:oel="http://schemas.microsoft.com/office/2019/extlst" xmlns:r="http://schemas.openxmlformats.org/officeDocument/2006/relationships" xmlns:wp14="http://schemas.microsoft.com/office/word/2010/wordprocessingDrawing" xmlns:wp="http://schemas.openxmlformats.org/drawingml/2006/wordprocessingDrawing" xmlns:wpg="http://schemas.microsoft.com/office/word/2010/wordprocessingGroup" xmlns:wpi="http://schemas.microsoft.com/office/word/2010/wordprocessingInk" xmlns:wps="http://schemas.microsoft.com/office/word/2010/wordprocessingShape" xmlns:o="urn:schemas-microsoft-com:office:office" xmlns:v="urn:schemas-microsoft-com:vml" xmlns:w10="urn:schemas-microsoft-com:office:word" xmlns:w="http://schemas.openxmlformats.org/wordprocessingml/2006/main" xmlns:w14="http://schemas.microsoft.com/office/word/2010/wordml" xmlns:w15="http://schemas.microsoft.com/office/word/2012/wordml" xmlns:w16cex="http://schemas.microsoft.com/office/word/2018/wordml/cex" xmlns:w16cid="http://schemas.microsoft.com/office/word/2016/wordml/cid" xmlns:w16="http://schemas.microsoft.com/office/word/2018/wordml" xmlns:w16sdtdh="http://schemas.microsoft.com/office/word/2020/wordml/sdtdatahash" xmlns:w16sdtfl="http://schemas.microsoft.com/office/word/2024/wordml/sdtformatlock" xmlns:w16se="http://schemas.microsoft.com/office/word/2015/wordml/symex" xmlns:w16du="http://schemas.microsoft.com/office/word/2023/wordml/word16du" xmlns:wne="http://schemas.microsoft.com/office/word/2006/wordml" mc:Ignorable="w14 w15 w16se w16cid w16 w16cex w16sdtdh w16sdtfl w16du wp14">
   <w:body>
     <w:p>
       <w:pPr>
@@ -63,31 +63,37 @@
           <w:lang w:val="es-ES_tradnl"/>
         </w:rPr>
       </w:pPr>
-      <w:r>
-        <w:rPr>
-          <w:rFonts w:ascii="Calibri" w:hAnsi="Calibri" w:cs="Calibri"/>
-          <w:lang w:val="es-ES_tradnl"/>
-        </w:rPr>
-        <w:t xml:space="preserve">share_izquierda = (votos a partidos izquierda + centro-izquierda) / votos </w:t>
-      </w:r>
-      <w:commentRangeStart w:id="0"/>
-      <w:r>
-        <w:rPr>
-          <w:rFonts w:ascii="Calibri" w:hAnsi="Calibri" w:cs="Calibri"/>
-          <w:lang w:val="es-ES_tradnl"/>
-        </w:rPr>
-        <w:t>válidos</w:t>
-      </w:r>
-      <w:commentRangeEnd w:id="0"/>
-      <w:r>
-        <w:rPr>
-          <w:rStyle w:val="Refdecomentario"/>
-          <w:rFonts w:ascii="Calibri" w:hAnsi="Calibri" w:cs="Calibri"/>
-          <w:sz w:val="24"/>
-          <w:szCs w:val="24"/>
-          <w:lang w:val="es-ES_tradnl"/>
-        </w:rPr>
-        <w:commentReference w:id="0"/>
+      <w:proofErr w:type="spellStart"/>
+      <w:r>
+        <w:rPr>
+          <w:rFonts w:ascii="Calibri" w:hAnsi="Calibri" w:cs="Calibri"/>
+          <w:lang w:val="es-ES_tradnl"/>
+        </w:rPr>
+        <w:t>share_izquierda</w:t>
+      </w:r>
+      <w:proofErr w:type="spellEnd"/>
+      <w:r>
+        <w:rPr>
+          <w:rFonts w:ascii="Calibri" w:hAnsi="Calibri" w:cs="Calibri"/>
+          <w:lang w:val="es-ES_tradnl"/>
+        </w:rPr>
+        <w:t xml:space="preserve"> = (votos a partidos izquierda + </w:t>
+      </w:r>
+      <w:proofErr w:type="gramStart"/>
+      <w:r>
+        <w:rPr>
+          <w:rFonts w:ascii="Calibri" w:hAnsi="Calibri" w:cs="Calibri"/>
+          <w:lang w:val="es-ES_tradnl"/>
+        </w:rPr>
+        <w:t>centro-izquierda</w:t>
+      </w:r>
+      <w:proofErr w:type="gramEnd"/>
+      <w:r>
+        <w:rPr>
+          <w:rFonts w:ascii="Calibri" w:hAnsi="Calibri" w:cs="Calibri"/>
+          <w:lang w:val="es-ES_tradnl"/>
+        </w:rPr>
+        <w:t>) / votos válidos</w:t>
       </w:r>
     </w:p>
     <w:p>
@@ -103,12 +109,37 @@
           <w:lang w:val="es-ES_tradnl"/>
         </w:rPr>
       </w:pPr>
-      <w:r>
-        <w:rPr>
-          <w:rFonts w:ascii="Calibri" w:hAnsi="Calibri" w:cs="Calibri"/>
-          <w:lang w:val="es-ES_tradnl"/>
-        </w:rPr>
-        <w:t>share_derecha = (votos a partidos derecha + centro-derecha) / votos válidos</w:t>
+      <w:proofErr w:type="spellStart"/>
+      <w:r>
+        <w:rPr>
+          <w:rFonts w:ascii="Calibri" w:hAnsi="Calibri" w:cs="Calibri"/>
+          <w:lang w:val="es-ES_tradnl"/>
+        </w:rPr>
+        <w:t>share_derecha</w:t>
+      </w:r>
+      <w:proofErr w:type="spellEnd"/>
+      <w:r>
+        <w:rPr>
+          <w:rFonts w:ascii="Calibri" w:hAnsi="Calibri" w:cs="Calibri"/>
+          <w:lang w:val="es-ES_tradnl"/>
+        </w:rPr>
+        <w:t xml:space="preserve"> = (votos a partidos derecha + </w:t>
+      </w:r>
+      <w:proofErr w:type="gramStart"/>
+      <w:r>
+        <w:rPr>
+          <w:rFonts w:ascii="Calibri" w:hAnsi="Calibri" w:cs="Calibri"/>
+          <w:lang w:val="es-ES_tradnl"/>
+        </w:rPr>
+        <w:t>centro-derecha</w:t>
+      </w:r>
+      <w:proofErr w:type="gramEnd"/>
+      <w:r>
+        <w:rPr>
+          <w:rFonts w:ascii="Calibri" w:hAnsi="Calibri" w:cs="Calibri"/>
+          <w:lang w:val="es-ES_tradnl"/>
+        </w:rPr>
+        <w:t>) / votos válidos</w:t>
       </w:r>
     </w:p>
     <w:p>
@@ -124,12 +155,21 @@
           <w:lang w:val="es-ES_tradnl"/>
         </w:rPr>
       </w:pPr>
-      <w:r>
-        <w:rPr>
-          <w:rFonts w:ascii="Calibri" w:hAnsi="Calibri" w:cs="Calibri"/>
-          <w:lang w:val="es-ES_tradnl"/>
-        </w:rPr>
-        <w:t>share_centro = votos a partidos centro / votos válidos</w:t>
+      <w:proofErr w:type="spellStart"/>
+      <w:r>
+        <w:rPr>
+          <w:rFonts w:ascii="Calibri" w:hAnsi="Calibri" w:cs="Calibri"/>
+          <w:lang w:val="es-ES_tradnl"/>
+        </w:rPr>
+        <w:t>share_centro</w:t>
+      </w:r>
+      <w:proofErr w:type="spellEnd"/>
+      <w:r>
+        <w:rPr>
+          <w:rFonts w:ascii="Calibri" w:hAnsi="Calibri" w:cs="Calibri"/>
+          <w:lang w:val="es-ES_tradnl"/>
+        </w:rPr>
+        <w:t xml:space="preserve"> = votos a partidos centro / votos válidos</w:t>
       </w:r>
     </w:p>
     <w:p>
@@ -145,48 +185,39 @@
           <w:lang w:val="es-ES_tradnl"/>
         </w:rPr>
       </w:pPr>
-      <w:r>
-        <w:rPr>
-          <w:rFonts w:ascii="Calibri" w:hAnsi="Calibri" w:cs="Calibri"/>
-          <w:lang w:val="es-ES_tradnl"/>
-        </w:rPr>
-        <w:t xml:space="preserve">indice_izq_der = </w:t>
-      </w:r>
-      <w:r>
-        <w:rPr>
-          <w:rFonts w:ascii="Calibri" w:hAnsi="Calibri" w:cs="Calibri"/>
-          <w:lang w:val="es-ES_tradnl"/>
-        </w:rPr>
-        <w:t>(</w:t>
-      </w:r>
-      <w:r>
-        <w:rPr>
-          <w:rFonts w:ascii="Calibri" w:hAnsi="Calibri" w:cs="Calibri"/>
-          <w:lang w:val="es-ES_tradnl"/>
-        </w:rPr>
-        <w:t xml:space="preserve">share_izquierda </w:t>
-      </w:r>
-      <w:r>
-        <w:rPr>
-          <w:rFonts w:ascii="Calibri" w:hAnsi="Calibri" w:cs="Calibri"/>
-          <w:lang w:val="es-ES_tradnl"/>
-        </w:rPr>
-        <w:t>+ centro izquierda) –</w:t>
-      </w:r>
-      <w:r>
-        <w:rPr>
-          <w:rFonts w:ascii="Calibri" w:hAnsi="Calibri" w:cs="Calibri"/>
-          <w:lang w:val="es-ES_tradnl"/>
-        </w:rPr>
-        <w:t xml:space="preserve"> </w:t>
-      </w:r>
-      <w:r>
-        <w:rPr>
-          <w:rFonts w:ascii="Calibri" w:hAnsi="Calibri" w:cs="Calibri"/>
-          <w:lang w:val="es-ES_tradnl"/>
-        </w:rPr>
-        <w:t>(</w:t>
-      </w:r>
+      <w:proofErr w:type="spellStart"/>
+      <w:r>
+        <w:rPr>
+          <w:rFonts w:ascii="Calibri" w:hAnsi="Calibri" w:cs="Calibri"/>
+          <w:lang w:val="es-ES_tradnl"/>
+        </w:rPr>
+        <w:t>indice_izq_der</w:t>
+      </w:r>
+      <w:proofErr w:type="spellEnd"/>
+      <w:r>
+        <w:rPr>
+          <w:rFonts w:ascii="Calibri" w:hAnsi="Calibri" w:cs="Calibri"/>
+          <w:lang w:val="es-ES_tradnl"/>
+        </w:rPr>
+        <w:t xml:space="preserve"> = (</w:t>
+      </w:r>
+      <w:proofErr w:type="spellStart"/>
+      <w:r>
+        <w:rPr>
+          <w:rFonts w:ascii="Calibri" w:hAnsi="Calibri" w:cs="Calibri"/>
+          <w:lang w:val="es-ES_tradnl"/>
+        </w:rPr>
+        <w:t>share_izquierda</w:t>
+      </w:r>
+      <w:proofErr w:type="spellEnd"/>
+      <w:r>
+        <w:rPr>
+          <w:rFonts w:ascii="Calibri" w:hAnsi="Calibri" w:cs="Calibri"/>
+          <w:lang w:val="es-ES_tradnl"/>
+        </w:rPr>
+        <w:t xml:space="preserve"> + centro izquierda) – (</w:t>
+      </w:r>
+      <w:proofErr w:type="spellStart"/>
       <w:r>
         <w:rPr>
           <w:rFonts w:ascii="Calibri" w:hAnsi="Calibri" w:cs="Calibri"/>
@@ -194,6 +225,7 @@
         </w:rPr>
         <w:t>share_derecha</w:t>
       </w:r>
+      <w:proofErr w:type="spellEnd"/>
       <w:r>
         <w:rPr>
           <w:rFonts w:ascii="Calibri" w:hAnsi="Calibri" w:cs="Calibri"/>
@@ -215,54 +247,53 @@
           <w:lang w:val="es-ES_tradnl"/>
         </w:rPr>
       </w:pPr>
-      <w:r>
-        <w:rPr>
-          <w:rFonts w:ascii="Calibri" w:hAnsi="Calibri" w:cs="Calibri"/>
-          <w:lang w:val="es-ES_tradnl"/>
-        </w:rPr>
-        <w:t>indice_</w:t>
-      </w:r>
-      <w:r>
-        <w:rPr>
-          <w:rFonts w:ascii="Calibri" w:hAnsi="Calibri" w:cs="Calibri"/>
-          <w:lang w:val="es-ES_tradnl"/>
-        </w:rPr>
-        <w:t>cen</w:t>
-      </w:r>
-      <w:r>
-        <w:rPr>
-          <w:rFonts w:ascii="Calibri" w:hAnsi="Calibri" w:cs="Calibri"/>
-          <w:lang w:val="es-ES_tradnl"/>
-        </w:rPr>
-        <w:t>_der = (</w:t>
-      </w:r>
-      <w:r>
-        <w:rPr>
-          <w:rFonts w:ascii="Calibri" w:hAnsi="Calibri" w:cs="Calibri"/>
-          <w:lang w:val="es-ES_tradnl"/>
-        </w:rPr>
-        <w:t>centro</w:t>
-      </w:r>
-      <w:r>
-        <w:rPr>
-          <w:rFonts w:ascii="Calibri" w:hAnsi="Calibri" w:cs="Calibri"/>
-          <w:lang w:val="es-ES_tradnl"/>
-        </w:rPr>
-        <w:t xml:space="preserve"> + centro izquierda</w:t>
-      </w:r>
-      <w:r>
-        <w:rPr>
-          <w:rFonts w:ascii="Calibri" w:hAnsi="Calibri" w:cs="Calibri"/>
-          <w:lang w:val="es-ES_tradnl"/>
-        </w:rPr>
-        <w:t xml:space="preserve">  + </w:t>
-      </w:r>
-      <w:r>
-        <w:rPr>
-          <w:rFonts w:ascii="Calibri" w:hAnsi="Calibri" w:cs="Calibri"/>
-          <w:lang w:val="es-ES_tradnl"/>
-        </w:rPr>
-        <w:t>centro izquierda) – (share_derecha + centro derecha)</w:t>
+      <w:proofErr w:type="spellStart"/>
+      <w:r>
+        <w:rPr>
+          <w:rFonts w:ascii="Calibri" w:hAnsi="Calibri" w:cs="Calibri"/>
+          <w:lang w:val="es-ES_tradnl"/>
+        </w:rPr>
+        <w:t>indice_cen_der</w:t>
+      </w:r>
+      <w:proofErr w:type="spellEnd"/>
+      <w:r>
+        <w:rPr>
+          <w:rFonts w:ascii="Calibri" w:hAnsi="Calibri" w:cs="Calibri"/>
+          <w:lang w:val="es-ES_tradnl"/>
+        </w:rPr>
+        <w:t xml:space="preserve"> = (centro + centro </w:t>
+      </w:r>
+      <w:proofErr w:type="gramStart"/>
+      <w:r>
+        <w:rPr>
+          <w:rFonts w:ascii="Calibri" w:hAnsi="Calibri" w:cs="Calibri"/>
+          <w:lang w:val="es-ES_tradnl"/>
+        </w:rPr>
+        <w:t>izquierda  +</w:t>
+      </w:r>
+      <w:proofErr w:type="gramEnd"/>
+      <w:r>
+        <w:rPr>
+          <w:rFonts w:ascii="Calibri" w:hAnsi="Calibri" w:cs="Calibri"/>
+          <w:lang w:val="es-ES_tradnl"/>
+        </w:rPr>
+        <w:t xml:space="preserve"> centro izquierda) – (</w:t>
+      </w:r>
+      <w:proofErr w:type="spellStart"/>
+      <w:r>
+        <w:rPr>
+          <w:rFonts w:ascii="Calibri" w:hAnsi="Calibri" w:cs="Calibri"/>
+          <w:lang w:val="es-ES_tradnl"/>
+        </w:rPr>
+        <w:t>share_derecha</w:t>
+      </w:r>
+      <w:proofErr w:type="spellEnd"/>
+      <w:r>
+        <w:rPr>
+          <w:rFonts w:ascii="Calibri" w:hAnsi="Calibri" w:cs="Calibri"/>
+          <w:lang w:val="es-ES_tradnl"/>
+        </w:rPr>
+        <w:t xml:space="preserve"> + centro derecha)</w:t>
       </w:r>
     </w:p>
     <w:p>
@@ -278,26 +309,53 @@
           <w:lang w:val="es-ES_tradnl"/>
         </w:rPr>
       </w:pPr>
-      <w:r>
-        <w:rPr>
-          <w:rFonts w:ascii="Calibri" w:hAnsi="Calibri" w:cs="Calibri"/>
-          <w:lang w:val="es-ES_tradnl"/>
-        </w:rPr>
-        <w:t>indice_</w:t>
-      </w:r>
-      <w:r>
-        <w:rPr>
-          <w:rFonts w:ascii="Calibri" w:hAnsi="Calibri" w:cs="Calibri"/>
-          <w:lang w:val="es-ES_tradnl"/>
-        </w:rPr>
-        <w:t>cen</w:t>
-      </w:r>
-      <w:r>
-        <w:rPr>
-          <w:rFonts w:ascii="Calibri" w:hAnsi="Calibri" w:cs="Calibri"/>
-          <w:lang w:val="es-ES_tradnl"/>
-        </w:rPr>
-        <w:t>_der = (share_izquierda + centro izquierda) – (share_derecha + centro derecha)</w:t>
+      <w:proofErr w:type="spellStart"/>
+      <w:r>
+        <w:rPr>
+          <w:rFonts w:ascii="Calibri" w:hAnsi="Calibri" w:cs="Calibri"/>
+          <w:lang w:val="es-ES_tradnl"/>
+        </w:rPr>
+        <w:t>indice_cen_der</w:t>
+      </w:r>
+      <w:proofErr w:type="spellEnd"/>
+      <w:r>
+        <w:rPr>
+          <w:rFonts w:ascii="Calibri" w:hAnsi="Calibri" w:cs="Calibri"/>
+          <w:lang w:val="es-ES_tradnl"/>
+        </w:rPr>
+        <w:t xml:space="preserve"> = (</w:t>
+      </w:r>
+      <w:proofErr w:type="spellStart"/>
+      <w:r>
+        <w:rPr>
+          <w:rFonts w:ascii="Calibri" w:hAnsi="Calibri" w:cs="Calibri"/>
+          <w:lang w:val="es-ES_tradnl"/>
+        </w:rPr>
+        <w:t>share_izquierda</w:t>
+      </w:r>
+      <w:proofErr w:type="spellEnd"/>
+      <w:r>
+        <w:rPr>
+          <w:rFonts w:ascii="Calibri" w:hAnsi="Calibri" w:cs="Calibri"/>
+          <w:lang w:val="es-ES_tradnl"/>
+        </w:rPr>
+        <w:t xml:space="preserve"> + centro izquierda) – (</w:t>
+      </w:r>
+      <w:proofErr w:type="spellStart"/>
+      <w:r>
+        <w:rPr>
+          <w:rFonts w:ascii="Calibri" w:hAnsi="Calibri" w:cs="Calibri"/>
+          <w:lang w:val="es-ES_tradnl"/>
+        </w:rPr>
+        <w:t>share_derecha</w:t>
+      </w:r>
+      <w:proofErr w:type="spellEnd"/>
+      <w:r>
+        <w:rPr>
+          <w:rFonts w:ascii="Calibri" w:hAnsi="Calibri" w:cs="Calibri"/>
+          <w:lang w:val="es-ES_tradnl"/>
+        </w:rPr>
+        <w:t xml:space="preserve"> + centro derecha)</w:t>
       </w:r>
     </w:p>
     <w:p>
@@ -313,12 +371,42 @@
           <w:lang w:val="es-ES_tradnl"/>
         </w:rPr>
       </w:pPr>
+      <w:proofErr w:type="spellStart"/>
       <w:r>
         <w:rPr>
           <w:rFonts w:ascii="Calibri" w:hAnsi="Calibri" w:cs="Calibri"/>
           <w:lang w:val="es-ES_tradnl"/>
         </w:rPr>
         <w:t>share_peronismo</w:t>
+      </w:r>
+      <w:proofErr w:type="spellEnd"/>
+      <w:r>
+        <w:rPr>
+          <w:rFonts w:ascii="Calibri" w:hAnsi="Calibri" w:cs="Calibri"/>
+          <w:lang w:val="es-ES_tradnl"/>
+        </w:rPr>
+        <w:t xml:space="preserve"> = </w:t>
+      </w:r>
+      <w:r>
+        <w:rPr>
+          <w:rFonts w:ascii="Calibri" w:hAnsi="Calibri" w:cs="Calibri"/>
+          <w:lang w:val="es-ES_tradnl"/>
+        </w:rPr>
+        <w:t xml:space="preserve">votos a partidos </w:t>
+      </w:r>
+      <w:r>
+        <w:rPr>
+          <w:rFonts w:ascii="Calibri" w:hAnsi="Calibri" w:cs="Calibri"/>
+          <w:lang w:val="es-ES_tradnl"/>
+        </w:rPr>
+        <w:t>peronistas</w:t>
+      </w:r>
+      <w:r>
+        <w:rPr>
+          <w:rFonts w:ascii="Calibri" w:hAnsi="Calibri" w:cs="Calibri"/>
+          <w:lang w:val="es-ES_tradnl"/>
+        </w:rPr>
+        <w:t xml:space="preserve"> / votos válidos</w:t>
       </w:r>
     </w:p>
     <w:p>
@@ -334,12 +422,42 @@
           <w:lang w:val="es-ES_tradnl"/>
         </w:rPr>
       </w:pPr>
+      <w:proofErr w:type="spellStart"/>
       <w:r>
         <w:rPr>
           <w:rFonts w:ascii="Calibri" w:hAnsi="Calibri" w:cs="Calibri"/>
           <w:lang w:val="es-ES_tradnl"/>
         </w:rPr>
         <w:t>share_radicalismo</w:t>
+      </w:r>
+      <w:proofErr w:type="spellEnd"/>
+      <w:r>
+        <w:rPr>
+          <w:rFonts w:ascii="Calibri" w:hAnsi="Calibri" w:cs="Calibri"/>
+          <w:lang w:val="es-ES_tradnl"/>
+        </w:rPr>
+        <w:t xml:space="preserve"> = </w:t>
+      </w:r>
+      <w:r>
+        <w:rPr>
+          <w:rFonts w:ascii="Calibri" w:hAnsi="Calibri" w:cs="Calibri"/>
+          <w:lang w:val="es-ES_tradnl"/>
+        </w:rPr>
+        <w:t xml:space="preserve">votos a partidos </w:t>
+      </w:r>
+      <w:r>
+        <w:rPr>
+          <w:rFonts w:ascii="Calibri" w:hAnsi="Calibri" w:cs="Calibri"/>
+          <w:lang w:val="es-ES_tradnl"/>
+        </w:rPr>
+        <w:t>radicales</w:t>
+      </w:r>
+      <w:r>
+        <w:rPr>
+          <w:rFonts w:ascii="Calibri" w:hAnsi="Calibri" w:cs="Calibri"/>
+          <w:lang w:val="es-ES_tradnl"/>
+        </w:rPr>
+        <w:t xml:space="preserve"> / votos válidos</w:t>
       </w:r>
     </w:p>
     <w:p>
@@ -425,14 +543,7 @@
           <w:rStyle w:val="s2"/>
           <w:rFonts w:ascii="Calibri" w:eastAsiaTheme="majorEastAsia" w:hAnsi="Calibri" w:cs="Calibri"/>
         </w:rPr>
-        <w:t>NEP = 1 / \sum p_i^2</w:t>
-      </w:r>
-      <w:r>
-        <w:rPr>
-          <w:rStyle w:val="s2"/>
-          <w:rFonts w:ascii="Calibri" w:eastAsiaTheme="majorEastAsia" w:hAnsi="Calibri" w:cs="Calibri"/>
-        </w:rPr>
-        <w:t xml:space="preserve">  </w:t>
+        <w:t xml:space="preserve">NEP = 1 / \sum p_i^2  </w:t>
       </w:r>
       <w:r>
         <w:rPr>
@@ -440,6 +551,7 @@
         </w:rPr>
         <w:t xml:space="preserve">donde </w:t>
       </w:r>
+      <w:proofErr w:type="spellStart"/>
       <w:r>
         <w:rPr>
           <w:rStyle w:val="s3"/>
@@ -447,6 +559,7 @@
         </w:rPr>
         <w:t>p_i</w:t>
       </w:r>
+      <w:proofErr w:type="spellEnd"/>
       <w:r>
         <w:rPr>
           <w:rFonts w:ascii="Calibri" w:hAnsi="Calibri" w:cs="Calibri"/>
@@ -465,13 +578,7 @@
         <w:rPr>
           <w:rFonts w:ascii="Calibri" w:hAnsi="Calibri" w:cs="Calibri"/>
         </w:rPr>
-        <w:t>M</w:t>
-      </w:r>
-      <w:r>
-        <w:rPr>
-          <w:rFonts w:ascii="Calibri" w:hAnsi="Calibri" w:cs="Calibri"/>
-        </w:rPr>
-        <w:t>argen entre primero y segundo: Si el margen baja la elección es más competitiva. Es consistente con realineamiento.</w:t>
+        <w:t>Margen entre primero y segundo: Si el margen baja la elección es más competitiva. Es consistente con realineamiento.</w:t>
       </w:r>
     </w:p>
     <w:p>
@@ -492,48 +599,8 @@
 </w:document>
 </file>
 
-<file path=word/comments.xml><?xml version="1.0" encoding="utf-8"?>
-<w:comments xmlns:wpc="http://schemas.microsoft.com/office/word/2010/wordprocessingCanvas" xmlns:cx="http://schemas.microsoft.com/office/drawing/2014/chartex" xmlns:cx1="http://schemas.microsoft.com/office/drawing/2015/9/8/chartex" xmlns:cx2="http://schemas.microsoft.com/office/drawing/2015/10/21/chartex" xmlns:cx3="http://schemas.microsoft.com/office/drawing/2016/5/9/chartex" xmlns:cx4="http://schemas.microsoft.com/office/drawing/2016/5/10/chartex" xmlns:cx5="http://schemas.microsoft.com/office/drawing/2016/5/11/chartex" xmlns:cx6="http://schemas.microsoft.com/office/drawing/2016/5/12/chartex" xmlns:cx7="http://schemas.microsoft.com/office/drawing/2016/5/13/chartex" xmlns:cx8="http://schemas.microsoft.com/office/drawing/2016/5/14/chartex" xmlns:mc="http://schemas.openxmlformats.org/markup-compatibility/2006" xmlns:aink="http://schemas.microsoft.com/office/drawing/2016/ink" xmlns:am3d="http://schemas.microsoft.com/office/drawing/2017/model3d" xmlns:o="urn:schemas-microsoft-com:office:office" xmlns:oel="http://schemas.microsoft.com/office/2019/extlst" xmlns:r="http://schemas.openxmlformats.org/officeDocument/2006/relationships" xmlns:m="http://schemas.openxmlformats.org/officeDocument/2006/math" xmlns:v="urn:schemas-microsoft-com:vml" xmlns:wp14="http://schemas.microsoft.com/office/word/2010/wordprocessingDrawing" xmlns:wp="http://schemas.openxmlformats.org/drawingml/2006/wordprocessingDrawing" xmlns:w10="urn:schemas-microsoft-com:office:word" xmlns:w="http://schemas.openxmlformats.org/wordprocessingml/2006/main" xmlns:w14="http://schemas.microsoft.com/office/word/2010/wordml" xmlns:w15="http://schemas.microsoft.com/office/word/2012/wordml" xmlns:w16cex="http://schemas.microsoft.com/office/word/2018/wordml/cex" xmlns:w16cid="http://schemas.microsoft.com/office/word/2016/wordml/cid" xmlns:w16="http://schemas.microsoft.com/office/word/2018/wordml" xmlns:w16du="http://schemas.microsoft.com/office/word/2023/wordml/word16du" xmlns:w16sdtdh="http://schemas.microsoft.com/office/word/2020/wordml/sdtdatahash" xmlns:w16sdtfl="http://schemas.microsoft.com/office/word/2024/wordml/sdtformatlock" xmlns:w16se="http://schemas.microsoft.com/office/word/2015/wordml/symex" xmlns:wpg="http://schemas.microsoft.com/office/word/2010/wordprocessingGroup" xmlns:wpi="http://schemas.microsoft.com/office/word/2010/wordprocessingInk" xmlns:wne="http://schemas.microsoft.com/office/word/2006/wordml" xmlns:wps="http://schemas.microsoft.com/office/word/2010/wordprocessingShape" mc:Ignorable="w14 w15 w16se w16cid w16 w16cex w16sdtdh w16sdtfl w16du wp14">
-  <w:comment w:id="0" w:author="Florencia ruiz" w:date="2026-05-08T13:38:00Z" w:initials="Fr">
-    <w:p>
-      <w:r>
-        <w:rPr>
-          <w:rStyle w:val="Refdecomentario"/>
-        </w:rPr>
-        <w:annotationRef/>
-      </w:r>
-      <w:r>
-        <w:rPr>
-          <w:sz w:val="20"/>
-          <w:szCs w:val="20"/>
-        </w:rPr>
-        <w:t>o totales dependiendo de como haya construido el share blank</w:t>
-      </w:r>
-    </w:p>
-  </w:comment>
-</w:comments>
-</file>
-
-<file path=word/commentsExtended.xml><?xml version="1.0" encoding="utf-8"?>
-<w15:commentsEx xmlns:wpc="http://schemas.microsoft.com/office/word/2010/wordprocessingCanvas" xmlns:cx="http://schemas.microsoft.com/office/drawing/2014/chartex" xmlns:cx1="http://schemas.microsoft.com/office/drawing/2015/9/8/chartex" xmlns:cx2="http://schemas.microsoft.com/office/drawing/2015/10/21/chartex" xmlns:cx3="http://schemas.microsoft.com/office/drawing/2016/5/9/chartex" xmlns:cx4="http://schemas.microsoft.com/office/drawing/2016/5/10/chartex" xmlns:cx5="http://schemas.microsoft.com/office/drawing/2016/5/11/chartex" xmlns:cx6="http://schemas.microsoft.com/office/drawing/2016/5/12/chartex" xmlns:cx7="http://schemas.microsoft.com/office/drawing/2016/5/13/chartex" xmlns:cx8="http://schemas.microsoft.com/office/drawing/2016/5/14/chartex" xmlns:mc="http://schemas.openxmlformats.org/markup-compatibility/2006" xmlns:aink="http://schemas.microsoft.com/office/drawing/2016/ink" xmlns:am3d="http://schemas.microsoft.com/office/drawing/2017/model3d" xmlns:o="urn:schemas-microsoft-com:office:office" xmlns:oel="http://schemas.microsoft.com/office/2019/extlst" xmlns:r="http://schemas.openxmlformats.org/officeDocument/2006/relationships" xmlns:m="http://schemas.openxmlformats.org/officeDocument/2006/math" xmlns:v="urn:schemas-microsoft-com:vml" xmlns:wp14="http://schemas.microsoft.com/office/word/2010/wordprocessingDrawing" xmlns:wp="http://schemas.openxmlformats.org/drawingml/2006/wordprocessingDrawing" xmlns:w10="urn:schemas-microsoft-com:office:word" xmlns:w="http://schemas.openxmlformats.org/wordprocessingml/2006/main" xmlns:w14="http://schemas.microsoft.com/office/word/2010/wordml" xmlns:w15="http://schemas.microsoft.com/office/word/2012/wordml" xmlns:w16cex="http://schemas.microsoft.com/office/word/2018/wordml/cex" xmlns:w16cid="http://schemas.microsoft.com/office/word/2016/wordml/cid" xmlns:w16="http://schemas.microsoft.com/office/word/2018/wordml" xmlns:w16du="http://schemas.microsoft.com/office/word/2023/wordml/word16du" xmlns:w16sdtdh="http://schemas.microsoft.com/office/word/2020/wordml/sdtdatahash" xmlns:w16sdtfl="http://schemas.microsoft.com/office/word/2024/wordml/sdtformatlock" xmlns:w16se="http://schemas.microsoft.com/office/word/2015/wordml/symex" xmlns:wpg="http://schemas.microsoft.com/office/word/2010/wordprocessingGroup" xmlns:wpi="http://schemas.microsoft.com/office/word/2010/wordprocessingInk" xmlns:wne="http://schemas.microsoft.com/office/word/2006/wordml" xmlns:wps="http://schemas.microsoft.com/office/word/2010/wordprocessingShape" mc:Ignorable="w14 w15 w16se w16cid w16 w16cex w16sdtdh w16sdtfl w16du wp14">
-  <w15:commentEx w15:paraId="4D8611B1" w15:done="0"/>
-</w15:commentsEx>
-</file>
-
-<file path=word/commentsExtensible.xml><?xml version="1.0" encoding="utf-8"?>
-<w16cex:commentsExtensible xmlns:wpc="http://schemas.microsoft.com/office/word/2010/wordprocessingCanvas" xmlns:cx="http://schemas.microsoft.com/office/drawing/2014/chartex" xmlns:cx1="http://schemas.microsoft.com/office/drawing/2015/9/8/chartex" xmlns:cx2="http://schemas.microsoft.com/office/drawing/2015/10/21/chartex" xmlns:cx3="http://schemas.microsoft.com/office/drawing/2016/5/9/chartex" xmlns:cx4="http://schemas.microsoft.com/office/drawing/2016/5/10/chartex" xmlns:cx5="http://schemas.microsoft.com/office/drawing/2016/5/11/chartex" xmlns:cx6="http://schemas.microsoft.com/office/drawing/2016/5/12/chartex" xmlns:cx7="http://schemas.microsoft.com/office/drawing/2016/5/13/chartex" xmlns:cx8="http://schemas.microsoft.com/office/drawing/2016/5/14/chartex" xmlns:cr="http://schemas.microsoft.com/office/comments/2020/reactions" xmlns:mc="http://schemas.openxmlformats.org/markup-compatibility/2006" xmlns:aink="http://schemas.microsoft.com/office/drawing/2016/ink" xmlns:am3d="http://schemas.microsoft.com/office/drawing/2017/model3d" xmlns:o="urn:schemas-microsoft-com:office:office" xmlns:oel="http://schemas.microsoft.com/office/2019/extlst" xmlns:r="http://schemas.openxmlformats.org/officeDocument/2006/relationships" xmlns:m="http://schemas.openxmlformats.org/officeDocument/2006/math" xmlns:v="urn:schemas-microsoft-com:vml" xmlns:wp14="http://schemas.microsoft.com/office/word/2010/wordprocessingDrawing" xmlns:wp="http://schemas.openxmlformats.org/drawingml/2006/wordprocessingDrawing" xmlns:w10="urn:schemas-microsoft-com:office:word" xmlns:w="http://schemas.openxmlformats.org/wordprocessingml/2006/main" xmlns:w14="http://schemas.microsoft.com/office/word/2010/wordml" xmlns:w15="http://schemas.microsoft.com/office/word/2012/wordml" xmlns:w16cex="http://schemas.microsoft.com/office/word/2018/wordml/cex" xmlns:w16cid="http://schemas.microsoft.com/office/word/2016/wordml/cid" xmlns:w16="http://schemas.microsoft.com/office/word/2018/wordml" xmlns:w16du="http://schemas.microsoft.com/office/word/2023/wordml/word16du" xmlns:w16sdtdh="http://schemas.microsoft.com/office/word/2020/wordml/sdtdatahash" xmlns:w16sdtfl="http://schemas.microsoft.com/office/word/2024/wordml/sdtformatlock" xmlns:w16se="http://schemas.microsoft.com/office/word/2015/wordml/symex" xmlns:wpg="http://schemas.microsoft.com/office/word/2010/wordprocessingGroup" xmlns:wpi="http://schemas.microsoft.com/office/word/2010/wordprocessingInk" xmlns:wne="http://schemas.microsoft.com/office/word/2006/wordml" xmlns:wps="http://schemas.microsoft.com/office/word/2010/wordprocessingShape" mc:Ignorable="w14 w15 w16se w16cid w16 w16cex w16sdtdh w16sdtfl cr w16du wp14">
-  <w16cex:commentExtensible w16cex:durableId="4EEE95EA" w16cex:dateUtc="2026-05-08T16:38:00Z"/>
-</w16cex:commentsExtensible>
-</file>
-
-<file path=word/commentsIds.xml><?xml version="1.0" encoding="utf-8"?>
-<w16cid:commentsIds xmlns:wpc="http://schemas.microsoft.com/office/word/2010/wordprocessingCanvas" xmlns:cx="http://schemas.microsoft.com/office/drawing/2014/chartex" xmlns:cx1="http://schemas.microsoft.com/office/drawing/2015/9/8/chartex" xmlns:cx2="http://schemas.microsoft.com/office/drawing/2015/10/21/chartex" xmlns:cx3="http://schemas.microsoft.com/office/drawing/2016/5/9/chartex" xmlns:cx4="http://schemas.microsoft.com/office/drawing/2016/5/10/chartex" xmlns:cx5="http://schemas.microsoft.com/office/drawing/2016/5/11/chartex" xmlns:cx6="http://schemas.microsoft.com/office/drawing/2016/5/12/chartex" xmlns:cx7="http://schemas.microsoft.com/office/drawing/2016/5/13/chartex" xmlns:cx8="http://schemas.microsoft.com/office/drawing/2016/5/14/chartex" xmlns:mc="http://schemas.openxmlformats.org/markup-compatibility/2006" xmlns:aink="http://schemas.microsoft.com/office/drawing/2016/ink" xmlns:am3d="http://schemas.microsoft.com/office/drawing/2017/model3d" xmlns:o="urn:schemas-microsoft-com:office:office" xmlns:oel="http://schemas.microsoft.com/office/2019/extlst" xmlns:r="http://schemas.openxmlformats.org/officeDocument/2006/relationships" xmlns:m="http://schemas.openxmlformats.org/officeDocument/2006/math" xmlns:v="urn:schemas-microsoft-com:vml" xmlns:wp14="http://schemas.microsoft.com/office/word/2010/wordprocessingDrawing" xmlns:wp="http://schemas.openxmlformats.org/drawingml/2006/wordprocessingDrawing" xmlns:w10="urn:schemas-microsoft-com:office:word" xmlns:w="http://schemas.openxmlformats.org/wordprocessingml/2006/main" xmlns:w14="http://schemas.microsoft.com/office/word/2010/wordml" xmlns:w15="http://schemas.microsoft.com/office/word/2012/wordml" xmlns:w16cex="http://schemas.microsoft.com/office/word/2018/wordml/cex" xmlns:w16cid="http://schemas.microsoft.com/office/word/2016/wordml/cid" xmlns:w16="http://schemas.microsoft.com/office/word/2018/wordml" xmlns:w16du="http://schemas.microsoft.com/office/word/2023/wordml/word16du" xmlns:w16sdtdh="http://schemas.microsoft.com/office/word/2020/wordml/sdtdatahash" xmlns:w16sdtfl="http://schemas.microsoft.com/office/word/2024/wordml/sdtformatlock" xmlns:w16se="http://schemas.microsoft.com/office/word/2015/wordml/symex" xmlns:wpg="http://schemas.microsoft.com/office/word/2010/wordprocessingGroup" xmlns:wpi="http://schemas.microsoft.com/office/word/2010/wordprocessingInk" xmlns:wne="http://schemas.microsoft.com/office/word/2006/wordml" xmlns:wps="http://schemas.microsoft.com/office/word/2010/wordprocessingShape" mc:Ignorable="w14 w15 w16se w16cid w16 w16cex w16sdtdh w16sdtfl w16du wp14">
-  <w16cid:commentId w16cid:paraId="4D8611B1" w16cid:durableId="4EEE95EA"/>
-</w16cid:commentsIds>
-</file>
-
 <file path=word/numbering.xml><?xml version="1.0" encoding="utf-8"?>
-<w:numbering xmlns:wpc="http://schemas.microsoft.com/office/word/2010/wordprocessingCanvas" xmlns:cx="http://schemas.microsoft.com/office/drawing/2014/chartex" xmlns:cx1="http://schemas.microsoft.com/office/drawing/2015/9/8/chartex" xmlns:cx2="http://schemas.microsoft.com/office/drawing/2015/10/21/chartex" xmlns:cx3="http://schemas.microsoft.com/office/drawing/2016/5/9/chartex" xmlns:cx4="http://schemas.microsoft.com/office/drawing/2016/5/10/chartex" xmlns:cx5="http://schemas.microsoft.com/office/drawing/2016/5/11/chartex" xmlns:cx6="http://schemas.microsoft.com/office/drawing/2016/5/12/chartex" xmlns:cx7="http://schemas.microsoft.com/office/drawing/2016/5/13/chartex" xmlns:cx8="http://schemas.microsoft.com/office/drawing/2016/5/14/chartex" xmlns:mc="http://schemas.openxmlformats.org/markup-compatibility/2006" xmlns:aink="http://schemas.microsoft.com/office/drawing/2016/ink" xmlns:am3d="http://schemas.microsoft.com/office/drawing/2017/model3d" xmlns:o="urn:schemas-microsoft-com:office:office" xmlns:oel="http://schemas.microsoft.com/office/2019/extlst" xmlns:r="http://schemas.openxmlformats.org/officeDocument/2006/relationships" xmlns:m="http://schemas.openxmlformats.org/officeDocument/2006/math" xmlns:v="urn:schemas-microsoft-com:vml" xmlns:wp14="http://schemas.microsoft.com/office/word/2010/wordprocessingDrawing" xmlns:wp="http://schemas.openxmlformats.org/drawingml/2006/wordprocessingDrawing" xmlns:w10="urn:schemas-microsoft-com:office:word" xmlns:w="http://schemas.openxmlformats.org/wordprocessingml/2006/main" xmlns:w14="http://schemas.microsoft.com/office/word/2010/wordml" xmlns:w15="http://schemas.microsoft.com/office/word/2012/wordml" xmlns:w16cex="http://schemas.microsoft.com/office/word/2018/wordml/cex" xmlns:w16cid="http://schemas.microsoft.com/office/word/2016/wordml/cid" xmlns:w16="http://schemas.microsoft.com/office/word/2018/wordml" xmlns:w16du="http://schemas.microsoft.com/office/word/2023/wordml/word16du" xmlns:w16sdtdh="http://schemas.microsoft.com/office/word/2020/wordml/sdtdatahash" xmlns:w16sdtfl="http://schemas.microsoft.com/office/word/2024/wordml/sdtformatlock" xmlns:w16se="http://schemas.microsoft.com/office/word/2015/wordml/symex" xmlns:wpg="http://schemas.microsoft.com/office/word/2010/wordprocessingGroup" xmlns:wpi="http://schemas.microsoft.com/office/word/2010/wordprocessingInk" xmlns:wne="http://schemas.microsoft.com/office/word/2006/wordml" xmlns:wps="http://schemas.microsoft.com/office/word/2010/wordprocessingShape" mc:Ignorable="w14 w15 w16se w16cid w16 w16cex w16sdtdh w16sdtfl w16du wp14">
+<w:numbering xmlns:wpc="http://schemas.microsoft.com/office/word/2010/wordprocessingCanvas" xmlns:cx="http://schemas.microsoft.com/office/drawing/2014/chartex" xmlns:cx1="http://schemas.microsoft.com/office/drawing/2015/9/8/chartex" xmlns:cx2="http://schemas.microsoft.com/office/drawing/2015/10/21/chartex" xmlns:cx3="http://schemas.microsoft.com/office/drawing/2016/5/9/chartex" xmlns:cx4="http://schemas.microsoft.com/office/drawing/2016/5/10/chartex" xmlns:cx5="http://schemas.microsoft.com/office/drawing/2016/5/11/chartex" xmlns:cx6="http://schemas.microsoft.com/office/drawing/2016/5/12/chartex" xmlns:cx7="http://schemas.microsoft.com/office/drawing/2016/5/13/chartex" xmlns:cx8="http://schemas.microsoft.com/office/drawing/2016/5/14/chartex" xmlns:mc="http://schemas.openxmlformats.org/markup-compatibility/2006" xmlns:m="http://schemas.openxmlformats.org/officeDocument/2006/math" xmlns:aink="http://schemas.microsoft.com/office/drawing/2016/ink" xmlns:am3d="http://schemas.microsoft.com/office/drawing/2017/model3d" xmlns:oel="http://schemas.microsoft.com/office/2019/extlst" xmlns:r="http://schemas.openxmlformats.org/officeDocument/2006/relationships" xmlns:wp14="http://schemas.microsoft.com/office/word/2010/wordprocessingDrawing" xmlns:wp="http://schemas.openxmlformats.org/drawingml/2006/wordprocessingDrawing" xmlns:wpg="http://schemas.microsoft.com/office/word/2010/wordprocessingGroup" xmlns:wpi="http://schemas.microsoft.com/office/word/2010/wordprocessingInk" xmlns:wps="http://schemas.microsoft.com/office/word/2010/wordprocessingShape" xmlns:o="urn:schemas-microsoft-com:office:office" xmlns:v="urn:schemas-microsoft-com:vml" xmlns:w10="urn:schemas-microsoft-com:office:word" xmlns:w="http://schemas.openxmlformats.org/wordprocessingml/2006/main" xmlns:w14="http://schemas.microsoft.com/office/word/2010/wordml" xmlns:w15="http://schemas.microsoft.com/office/word/2012/wordml" xmlns:w16cex="http://schemas.microsoft.com/office/word/2018/wordml/cex" xmlns:w16cid="http://schemas.microsoft.com/office/word/2016/wordml/cid" xmlns:w16="http://schemas.microsoft.com/office/word/2018/wordml" xmlns:w16sdtdh="http://schemas.microsoft.com/office/word/2020/wordml/sdtdatahash" xmlns:w16sdtfl="http://schemas.microsoft.com/office/word/2024/wordml/sdtformatlock" xmlns:w16se="http://schemas.microsoft.com/office/word/2015/wordml/symex" xmlns:w16du="http://schemas.microsoft.com/office/word/2023/wordml/word16du" xmlns:wne="http://schemas.microsoft.com/office/word/2006/wordml" mc:Ignorable="w14 w15 w16se w16cid w16 w16cex w16sdtdh w16sdtfl w16du wp14">
   <w:abstractNum w:abstractNumId="0" w15:restartNumberingAfterBreak="0">
     <w:nsid w:val="5E4D68F7"/>
     <w:multiLevelType w:val="hybridMultilevel"/>
@@ -772,16 +839,8 @@
 </w:numbering>
 </file>
 
-<file path=word/people.xml><?xml version="1.0" encoding="utf-8"?>
-<w15:people xmlns:wpc="http://schemas.microsoft.com/office/word/2010/wordprocessingCanvas" xmlns:cx="http://schemas.microsoft.com/office/drawing/2014/chartex" xmlns:cx1="http://schemas.microsoft.com/office/drawing/2015/9/8/chartex" xmlns:cx2="http://schemas.microsoft.com/office/drawing/2015/10/21/chartex" xmlns:cx3="http://schemas.microsoft.com/office/drawing/2016/5/9/chartex" xmlns:cx4="http://schemas.microsoft.com/office/drawing/2016/5/10/chartex" xmlns:cx5="http://schemas.microsoft.com/office/drawing/2016/5/11/chartex" xmlns:cx6="http://schemas.microsoft.com/office/drawing/2016/5/12/chartex" xmlns:cx7="http://schemas.microsoft.com/office/drawing/2016/5/13/chartex" xmlns:cx8="http://schemas.microsoft.com/office/drawing/2016/5/14/chartex" xmlns:mc="http://schemas.openxmlformats.org/markup-compatibility/2006" xmlns:aink="http://schemas.microsoft.com/office/drawing/2016/ink" xmlns:am3d="http://schemas.microsoft.com/office/drawing/2017/model3d" xmlns:o="urn:schemas-microsoft-com:office:office" xmlns:oel="http://schemas.microsoft.com/office/2019/extlst" xmlns:r="http://schemas.openxmlformats.org/officeDocument/2006/relationships" xmlns:m="http://schemas.openxmlformats.org/officeDocument/2006/math" xmlns:v="urn:schemas-microsoft-com:vml" xmlns:wp14="http://schemas.microsoft.com/office/word/2010/wordprocessingDrawing" xmlns:wp="http://schemas.openxmlformats.org/drawingml/2006/wordprocessingDrawing" xmlns:w10="urn:schemas-microsoft-com:office:word" xmlns:w="http://schemas.openxmlformats.org/wordprocessingml/2006/main" xmlns:w14="http://schemas.microsoft.com/office/word/2010/wordml" xmlns:w15="http://schemas.microsoft.com/office/word/2012/wordml" xmlns:w16cex="http://schemas.microsoft.com/office/word/2018/wordml/cex" xmlns:w16cid="http://schemas.microsoft.com/office/word/2016/wordml/cid" xmlns:w16="http://schemas.microsoft.com/office/word/2018/wordml" xmlns:w16du="http://schemas.microsoft.com/office/word/2023/wordml/word16du" xmlns:w16sdtdh="http://schemas.microsoft.com/office/word/2020/wordml/sdtdatahash" xmlns:w16sdtfl="http://schemas.microsoft.com/office/word/2024/wordml/sdtformatlock" xmlns:w16se="http://schemas.microsoft.com/office/word/2015/wordml/symex" xmlns:wpg="http://schemas.microsoft.com/office/word/2010/wordprocessingGroup" xmlns:wpi="http://schemas.microsoft.com/office/word/2010/wordprocessingInk" xmlns:wne="http://schemas.microsoft.com/office/word/2006/wordml" xmlns:wps="http://schemas.microsoft.com/office/word/2010/wordprocessingShape" mc:Ignorable="w14 w15 w16se w16cid w16 w16cex w16sdtdh w16sdtfl w16du wp14">
-  <w15:person w15:author="Florencia ruiz">
-    <w15:presenceInfo w15:providerId="Windows Live" w15:userId="7b066f386e5ac473"/>
-  </w15:person>
-</w15:people>
-</file>
-
 <file path=word/styles.xml><?xml version="1.0" encoding="utf-8"?>
-<w:styles xmlns:mc="http://schemas.openxmlformats.org/markup-compatibility/2006" xmlns:r="http://schemas.openxmlformats.org/officeDocument/2006/relationships" xmlns:w="http://schemas.openxmlformats.org/wordprocessingml/2006/main" xmlns:w14="http://schemas.microsoft.com/office/word/2010/wordml" xmlns:w15="http://schemas.microsoft.com/office/word/2012/wordml" xmlns:w16cex="http://schemas.microsoft.com/office/word/2018/wordml/cex" xmlns:w16cid="http://schemas.microsoft.com/office/word/2016/wordml/cid" xmlns:w16="http://schemas.microsoft.com/office/word/2018/wordml" xmlns:w16du="http://schemas.microsoft.com/office/word/2023/wordml/word16du" xmlns:w16sdtdh="http://schemas.microsoft.com/office/word/2020/wordml/sdtdatahash" xmlns:w16sdtfl="http://schemas.microsoft.com/office/word/2024/wordml/sdtformatlock" xmlns:w16se="http://schemas.microsoft.com/office/word/2015/wordml/symex" mc:Ignorable="w14 w15 w16se w16cid w16 w16cex w16sdtdh w16sdtfl w16du">
+<w:styles xmlns:mc="http://schemas.openxmlformats.org/markup-compatibility/2006" xmlns:r="http://schemas.openxmlformats.org/officeDocument/2006/relationships" xmlns:w="http://schemas.openxmlformats.org/wordprocessingml/2006/main" xmlns:w14="http://schemas.microsoft.com/office/word/2010/wordml" xmlns:w15="http://schemas.microsoft.com/office/word/2012/wordml" xmlns:w16cex="http://schemas.microsoft.com/office/word/2018/wordml/cex" xmlns:w16cid="http://schemas.microsoft.com/office/word/2016/wordml/cid" xmlns:w16="http://schemas.microsoft.com/office/word/2018/wordml" xmlns:w16sdtdh="http://schemas.microsoft.com/office/word/2020/wordml/sdtdatahash" xmlns:w16sdtfl="http://schemas.microsoft.com/office/word/2024/wordml/sdtformatlock" xmlns:w16se="http://schemas.microsoft.com/office/word/2015/wordml/symex" xmlns:w16du="http://schemas.microsoft.com/office/word/2023/wordml/word16du" mc:Ignorable="w14 w15 w16se w16cid w16 w16cex w16sdtdh w16sdtfl w16du">
   <w:docDefaults>
     <w:rPrDefault>
       <w:rPr>

</xml_diff>